<commit_message>
proposal template: stop template images leaking into the SharePoint TOC
3 image-only paragraphs in proposal_template.docx were styled as Headings
(2x heading 2, 1x full-page heading 1). The template's TOC field collects BY
STYLE NAME (TOC \t "Heading 1,1,...,Heading 6,6,"), so on SharePoint's
update-fields those heading-styled image paragraphs became stray TOC entries
(the image got pulled into the mục lục). Skill-generated diagrams sit in Normal
paragraphs, so they were never affected.

Fix: demote those 3 image paragraphs Heading -> Normal (keeping their direct
centering/spacing/indent so the images don't move). An outlineLvl override
wouldn't work because \t matches the style NAME. Verified: image-paras-in-TOC
3->0, real headings unchanged (31), 20 placeholders intact, TOC field intact,
doc opens clean, size unchanged. Lesson recorded in LESSONS_LEARNED.
</commit_message>
<xml_diff>
--- a/technical-proposal/skill/linhpham-technicalproposal/templates/proposal_template.docx
+++ b/technical-proposal/skill/linhpham-technicalproposal/templates/proposal_template.docx
@@ -1458,7 +1458,7 @@
     </w:p>
     <w:p>
       <w:pPr>
-        <w:pStyle w:val="3"/>
+        <w:pStyle w:val="1"/>
         <w:spacing w:before="200" w:line="259" w:lineRule="auto"/>
         <w:jc w:val="center"/>
         <w:rPr>
@@ -3370,7 +3370,7 @@
     </w:p>
     <w:p>
       <w:pPr>
-        <w:pStyle w:val="3"/>
+        <w:pStyle w:val="1"/>
         <w:spacing w:before="360" w:line="259" w:lineRule="auto"/>
         <w:ind w:left="576" w:firstLine="0"/>
         <w:jc w:val="center"/>
@@ -5797,7 +5797,7 @@
     </w:p>
     <w:p>
       <w:pPr>
-        <w:pStyle w:val="2"/>
+        <w:pStyle w:val="1"/>
         <w:spacing w:before="0" w:after="0" w:line="240" w:lineRule="auto"/>
         <w:ind w:left="0" w:firstLine="0"/>
         <w:keepLines/>

</xml_diff>

<commit_message>
proposal template: fix full-page cover image overflowing to a blank page on SharePoint
The page-1 cover image (and a second full-page image) were INLINE at 8.27x11.69in
in zero-margin sections. An inline image at ~100% of the content height plus the
paragraph line-height tips just over the page, forcing a blank extra page after it
(worse under SharePoint's reflow). This is the blank page-2 the user had to fix by
hand via 'change wrap'.

Fix: convert both full-page inline images to floating anchors (wp:inline -> wp:anchor,
behindDoc=1, relativeFrom=page offset 0,0, wrapNone), same extent. A floating image
doesn't consume text-flow height, so the cover fills the page with no overflow.
Verified: 2 anchors (8.27x11.69, behindDoc=1, wrapNone), 9 drawings unchanged, XML
well-formed, doc opens, 20 placeholders + TOC intact, image-heading guard still passes.
Lesson recorded.
</commit_message>
<xml_diff>
--- a/technical-proposal/skill/linhpham-technicalproposal/templates/proposal_template.docx
+++ b/technical-proposal/skill/linhpham-technicalproposal/templates/proposal_template.docx
@@ -22,9 +22,17 @@
       </w:pPr>
       <w:r>
         <w:drawing>
-          <wp:inline distT="0" distB="0" distL="0" distR="0">
+          <wp:anchor distT="0" distB="0" distL="0" distR="0" simplePos="0" relativeHeight="0" behindDoc="1" locked="0" layoutInCell="1" allowOverlap="1">
+            <wp:simplePos x="0" y="0"/>
+            <wp:positionH relativeFrom="page">
+              <wp:posOffset>0</wp:posOffset>
+            </wp:positionH>
+            <wp:positionV relativeFrom="page">
+              <wp:posOffset>0</wp:posOffset>
+            </wp:positionV>
             <wp:extent cx="7560310" cy="10692130"/>
             <wp:effectExtent l="0" t="0" r="0" b="0"/>
+            <wp:wrapNone/>
             <wp:docPr id="14" name="image5.jpg"/>
             <wp:cNvGraphicFramePr/>
             <a:graphic xmlns:a="http://schemas.openxmlformats.org/drawingml/2006/main">
@@ -53,7 +61,7 @@
                 </pic:pic>
               </a:graphicData>
             </a:graphic>
-          </wp:inline>
+          </wp:anchor>
         </w:drawing>
       </w:r>
     </w:p>
@@ -5806,9 +5814,17 @@
       <w:bookmarkEnd w:id="28"/>
       <w:r>
         <w:drawing>
-          <wp:inline distT="0" distB="0" distL="0" distR="0">
+          <wp:anchor distT="0" distB="0" distL="0" distR="0" simplePos="0" relativeHeight="0" behindDoc="1" locked="0" layoutInCell="1" allowOverlap="1">
+            <wp:simplePos x="0" y="0"/>
+            <wp:positionH relativeFrom="page">
+              <wp:posOffset>0</wp:posOffset>
+            </wp:positionH>
+            <wp:positionV relativeFrom="page">
+              <wp:posOffset>0</wp:posOffset>
+            </wp:positionV>
             <wp:extent cx="7560310" cy="10692130"/>
             <wp:effectExtent l="0" t="0" r="0" b="0"/>
+            <wp:wrapNone/>
             <wp:docPr id="17" name="image25.jpg"/>
             <wp:cNvGraphicFramePr/>
             <a:graphic xmlns:a="http://schemas.openxmlformats.org/drawingml/2006/main">
@@ -5837,7 +5853,7 @@
                 </pic:pic>
               </a:graphicData>
             </a:graphic>
-          </wp:inline>
+          </wp:anchor>
         </w:drawing>
       </w:r>
     </w:p>

</xml_diff>